<commit_message>
docs: M&M — protocoles paillasse transposes du manuscrit dorigine (extraction, PCR, sequencage)
</commit_message>
<xml_diff>
--- a/docs/materials_and_methods.docx
+++ b/docs/materials_and_methods.docx
@@ -16,7 +16,7 @@
           <w:b w:val="0"/>
           <w:i/>
         </w:rPr>
-        <w:t>Projet microbiome-hybrid. Section rédigée à partir des scripts, de la config et des résultats versionnés sur le cluster (juillet 2026). Les paramètres bioinformatiques sont exacts (extraits des scripts) ; les éléments de paillasse absents du dépôt sont signalés en rouge et restent à renseigner par les expérimentateurs.</w:t>
+        <w:t>Projet microbiome-hybrid. Les paramètres bioinformatiques (§5–7) sont extraits des scripts versionnés sur le cluster (juillet 2026). Les protocoles de paillasse (§2–4) sont transposés du manuscrit d'origine du projet (Guivier, Pech, Martin, Chappaz, Gilles — même assay 16S V4, même équipe) ; ils sont signalés en bleu et restent à confirmer pour le lot d'échantillons Durance. Les informations encore absentes sont en rouge.</w:t>
       </w:r>
     </w:p>
     <w:p>
@@ -33,7 +33,7 @@
           <w:b w:val="0"/>
           <w:i w:val="0"/>
         </w:rPr>
-        <w:t>We studied the host-associated bacterial microbiota of two interbreeding cyprinid fishes, the nase Chondrostoma nasus (hotu, code Cn) and the toxostome Parachondrostoma toxostoma (code Pt), together with unassigned Chondrostoma sp. individuals (code Ch) from their contact zone, which include the two parental species and their hybrids not yet resolved by field determination. Fish were sampled across nine sites of the Rhône drainage (Durance and Ardèche rivers, France) over two years (2014 and 2015), spanning a gradient of hybrid-zone context (allopatry, sympatry with hybridisation, and asymmetric introgression).</w:t>
+        <w:t>We studied the host-associated bacterial microbiota of two interbreeding cyprinid fishes, the nase Chondrostoma nasus (hotu, code Cn) and the toxostome Parachondrostoma toxostoma (code Pt), together with unassigned Chondrostoma sp. individuals (code Ch) from their contact zone, which comprise the two parental species and their as-yet field-unresolved hybrids. Fish were sampled across nine sites of the Rhône drainage (Durance and Ardèche rivers, France) over two years (2014 and 2015), spanning a gradient of hybrid-zone context (allopatry, sympatry with hybridisation, and asymmetric introgression). A total of 183 individual fish were sequenced (134 Chondrostoma sp., 37 C. nasus, 12 P. toxostoma). The design is strongly unbalanced: site and year are largely confounded (only two sites were sampled in both years), as are taxon and site.</w:t>
       </w:r>
     </w:p>
     <w:p>
@@ -42,7 +42,16 @@
           <w:b w:val="0"/>
           <w:i w:val="0"/>
         </w:rPr>
-        <w:t>A total of 183 individual fish were sampled and sequenced (134 Chondrostoma sp., 37 C. nasus, 12 P. toxostoma). The sampling design is strongly unbalanced: site and year are largely confounded (only two sites were sampled in both years), as are taxon and site.</w:t>
+        <w:t>Specimens were captured by electrofishing, euthanised by cervical dislocation, and immediately dissected with sterile material. The study was conducted according to international guidelines of animal care and under national protocol authorisations n° 2014-156-0001 and n° 2015-1426DDT605.</w:t>
+      </w:r>
+    </w:p>
+    <w:p>
+      <w:r>
+        <w:rPr>
+          <w:i/>
+          <w:color w:val="1F6FC0"/>
+        </w:rPr>
+        <w:t>[Transposé du manuscrit d'origine — à confirmer pour le lot Durance : mode de capture (pêche électrique), euthanasie par dislocation cervicale et numéros d'autorisation — identiques au manuscrit d'origine ; vérifier qu'ils couvrent bien l'ensemble des 9 sites et les deux années.]</w:t>
       </w:r>
     </w:p>
     <w:p>
@@ -51,7 +60,7 @@
           <w:i/>
           <w:color w:val="C00000"/>
         </w:rPr>
-        <w:t>[À COMPLÉTER : dates précises de collecte, méthode de capture (pêche électrique ?), nombre d'individus par site/année, coordonnées des 9 sites et correspondance code↔nom de site (canal, Ain, Büech, St-Just, Baume, Avignon…), numéros d'autorisation de pêche et d'éthique animale, mode d'euthanasie.]</w:t>
+        <w:t>[À COMPLÉTER : dates précises de collecte, effectifs par site/année, coordonnées des 9 sites et correspondance code↔nom de site (canal, Ain, Büech, St-Just, Baume, Avignon…).]</w:t>
       </w:r>
     </w:p>
     <w:p>
@@ -60,7 +69,7 @@
           <w:b w:val="0"/>
           <w:i/>
         </w:rPr>
-        <w:t>Note : l'identification fine des individus Chondrostoma sp. (statut parental vs hybride, code Species = Cn/Pt/Hy) est en cours de caractérisation et sera intégrée pour l'analyse de la question hybride ; elle n'affecte pas le traitement bioinformatique décrit ci-dessous.</w:t>
+        <w:t>L'identification fine des Chondrostoma sp. (statut parental vs hybride, code Species = Cn/Pt/Hy) est en cours de caractérisation et sera intégrée pour l'analyse de la question hybride ; elle n'affecte pas le traitement bioinformatique ci-dessous.</w:t>
       </w:r>
     </w:p>
     <w:p>
@@ -77,16 +86,16 @@
           <w:b w:val="0"/>
           <w:i w:val="0"/>
         </w:rPr>
-        <w:t>Four tissues were sampled per fish, spanning a gradient of contact with the external environment: caudal fin (code 01), midgut (02), hindgut (03) and gill (05). Nine tissues were extracted twice (independent re-extractions of the same tissue, flagged as extraction ‘bis’) and are treated as technical replicates.</w:t>
+        <w:t>Four tissues were sampled per fish, spanning a gradient of contact with the external environment: caudal fin (code 01), midgut (02), hindgut (03) and gill (05). A piece of each tissue was stored in 95% ethanol at −80 °C until molecular analysis. Nine tissues were re-extracted independently (flagged ‘bis’) and are treated as technical replicates.</w:t>
       </w:r>
     </w:p>
     <w:p>
       <w:r>
         <w:rPr>
           <w:i/>
-          <w:color w:val="C00000"/>
+          <w:color w:val="1F6FC0"/>
         </w:rPr>
-        <w:t>[À COMPLÉTER : conditions de dissection (matériel stérile ?), mode de conservation des tissus (éthanol, congélation ?) et température/durée de stockage avant extraction.]</w:t>
+        <w:t>[Transposé du manuscrit d'origine — à confirmer pour le lot Durance : conservation en éthanol 95% à −80 °C et dissection stérile — repris du manuscrit d'origine (gills/midgut) et étendus ici aux 4 tissus ; confirmer que caudale et hindgut ont suivi le même protocole.]</w:t>
       </w:r>
     </w:p>
     <w:p>
@@ -103,7 +112,7 @@
           <w:b w:val="0"/>
           <w:i w:val="0"/>
         </w:rPr>
-        <w:t>Bacterial community composition was characterised by amplicon sequencing of the V4 hypervariable region of the 16S rRNA gene, using the Caporaso primers 515F (GTGCCAGCMGCCGCGGTAA) and 806R (GGACTACHVGGGTWTCTAAT). Libraries followed the Schloss dual-index protocol, in which the amplification primers also serve as the sequencing primers; consequently the primer sequences are not present in the reads.</w:t>
+        <w:t>Bacterial DNA was extracted from each tissue with the Qiagen Food Mericon kit (Qiagen, Venlo, Netherlands), following a slightly modified protocol detailed in Guivier et al. (2018). A 251 bp fragment of the V4 region of the bacterial 16S rRNA gene was amplified using the dual-index method of Kozich et al. (2013), with forward and reverse primers carrying an 8 bp index and Illumina adapters (Caporaso primers 515F GTGCCAGCMGCCGCGGTAA / 806R GGACTACHVGGGTWTCTAAT). DNA amplification, purification and pooling of PCR products followed Galan et al. (2016). The final library was quantified with the Kapa quantification kit (Kapa Biosystems) and loaded on an Illumina MiSeq flow cell with reagent kit v3 (2 × 300 cycles).</w:t>
       </w:r>
     </w:p>
     <w:p>
@@ -112,7 +121,16 @@
           <w:b w:val="0"/>
           <w:i w:val="0"/>
         </w:rPr>
-        <w:t>The same 768 libraries were sequenced three independent times on an Illumina MiSeq platform (runs durance1, durance2 and durance3; distinct flow cells and i5 index sets, identical plate layout and i7 indices). Each biological sample is therefore present in triplicate across runs, allowing the sequencing-run effect to be estimated directly, unconfounded with any biological factor.</w:t>
+        <w:t>For the present study, the same 768 libraries were sequenced three independent times (runs durance1, durance2 and durance3; distinct flow cells and i5 index sets, identical plate layout and i7 indices). Each biological sample is therefore present in triplicate across runs, allowing the sequencing-run effect to be estimated directly, unconfounded with any biological factor.</w:t>
+      </w:r>
+    </w:p>
+    <w:p>
+      <w:r>
+        <w:rPr>
+          <w:i/>
+          <w:color w:val="1F6FC0"/>
+        </w:rPr>
+        <w:t>[Transposé du manuscrit d'origine — à confirmer pour le lot Durance : kit d'extraction Qiagen Food Mericon, méthode dual-index Kozich (2013), protocole Galan (2016), quantification Kapa, MiSeq reagent kit v3 (2×300) — tous repris du manuscrit d'origine (même assay). À confirmer que le lot Durance a suivi exactement ce protocole d'extraction et de PCR.]</w:t>
       </w:r>
     </w:p>
     <w:p>
@@ -121,7 +139,7 @@
           <w:i/>
           <w:color w:val="C00000"/>
         </w:rPr>
-        <w:t>[À COMPLÉTER : kit d'extraction d'ADN et protocole, quantification, conditions de PCR (polymérase, nombre de cycles, volumes), stratégie d'indexation détaillée, chimie MiSeq (2×250 ou 2×300 ?), plateforme/plateau technique de séquençage, spike-in PhiX, dates des runs.]</w:t>
+        <w:t>[À COMPLÉTER : nombre exact de cycles PCR et polymérase utilisée ; dates des trois runs MiSeq ; taux de spike-in PhiX.]</w:t>
       </w:r>
     </w:p>
     <w:p>
@@ -138,7 +156,16 @@
           <w:b w:val="0"/>
           <w:i w:val="0"/>
         </w:rPr>
-        <w:t>Extraction blanks and no-template PCR controls (39 controls in total, each sequenced across the three runs) and two aliquots of a mock community (Mock-1, Mock-2) were processed and sequenced alongside the biological samples for contamination assessment and positive-control validation. The mock community was the ZymoBIOMICS Microbial Community Standard, whose bacterial members and their reference 16S sequences are used for validation (Section 7).</w:t>
+        <w:t>Extraction blanks and no-template PCR controls (39 controls in total, each sequenced across the three runs), and two aliquots of a commercial mock community — the ZymoBIOMICS Microbial Community Standard (Zymo Research, Irvine, CA, USA), a defined mixture of eight known bacterial taxa — were processed and sequenced alongside the biological samples for contamination assessment and positive-control validation.</w:t>
+      </w:r>
+    </w:p>
+    <w:p>
+      <w:r>
+        <w:rPr>
+          <w:i/>
+          <w:color w:val="1F6FC0"/>
+        </w:rPr>
+        <w:t>[Transposé du manuscrit d'origine — à confirmer pour le lot Durance : standard ZymoBIOMICS (8 taxons bactériens connus) et inclusion de contrôles négatifs/mock — repris du manuscrit d'origine.]</w:t>
       </w:r>
     </w:p>
     <w:p>
@@ -147,7 +174,7 @@
           <w:i/>
           <w:color w:val="C00000"/>
         </w:rPr>
-        <w:t>[À COMPLÉTER : référence catalogue exacte et NUMÉRO DE LOT du standard Zymo utilisé (détermine le jeu de souches de référence, cf. §7) ; nombre et nature précise des blancs d'extraction vs contrôles PCR.]</w:t>
+        <w:t>[À COMPLÉTER : référence catalogue et NUMÉRO DE LOT exact du standard Zymo (détermine le jeu de souches de référence, cf. §7) ; répartition précise blancs d'extraction vs contrôles PCR.]</w:t>
       </w:r>
     </w:p>
     <w:p>
@@ -164,7 +191,7 @@
           <w:b w:val="0"/>
           <w:i w:val="0"/>
         </w:rPr>
-        <w:t>Reads were processed with a custom, version-controlled pipeline (git-tracked; each parameter justified in the script headers). The three sequencing runs were processed separately through denoising and merged thereafter. Software versions: cutadapt 5.0; R 4.5.3 with DADA2 1.38.0; SILVA reference v138.2 (DADA2 formatted, Zenodo 14169026); BLAST+ 2.13.0; FastQC and MultiQC for quality control.</w:t>
+        <w:t>Reads were processed with a custom, version-controlled pipeline (git-tracked; each parameter justified in the script headers). The three runs were processed separately through denoising and merged thereafter. Software versions: cutadapt 5.0; R 4.5.3 with DADA2 1.38.0; SILVA reference v138.2 (DADA2 formatted, Zenodo 14169026); BLAST+ 2.13.0; FastQC and MultiQC for quality control. The 16S V4 primers, being also the sequencing primers (Schloss dual-index protocol), are not present in the reads; no 5′ primer trimming was therefore applied.</w:t>
       </w:r>
     </w:p>
     <w:p>
@@ -198,7 +225,7 @@
           <w:b w:val="0"/>
           <w:i w:val="0"/>
         </w:rPr>
-        <w:t>The 16S V4 primers co-amplify the mitochondrial 12S rRNA gene of the fish host (14–67% of reads per sample). Because the host 12S amplicon (~190 bp) is shorter than the bacterial V4 amplicon (~253 bp), host reads were removed upstream by length with cutadapt 5.0: the reverse complements of 806R and 515F were sought at the 3′ end of R1 and R2 respectively (options -a/-A, error rate -e 0.1, minimum overlap -O 10), and read pairs falling below 240 bp after trimming (--minimum-length 240) were discarded. In a genuine V4 amplicon of ~253 bp the opposite primer is never reached within a 251 bp read, so the read stays near full length and is retained; the shorter host 12S reads are trimmed below threshold and removed. Discarded reads were retained separately (--too-short-output) as an exploitable host signal.</w:t>
+        <w:t>The 16S V4 primers co-amplify the host mitochondrial 12S rRNA gene (14–67% of reads per sample). Because the host 12S amplicon (~190 bp) is shorter than the bacterial V4 amplicon (~253 bp), host reads were removed upstream by length with cutadapt 5.0: the reverse complements of 806R and 515F were sought at the 3′ end of R1 and R2 respectively (options -a/-A, error rate -e 0.1, minimum overlap -O 10), and read pairs shorter than 240 bp after trimming (--minimum-length 240) were discarded. In a genuine ~253 bp V4 amplicon the opposite primer is never reached within a 251 bp read, so the read stays near full length and is retained; shorter host 12S reads are trimmed below threshold and removed. Discarded reads were kept separately (--too-short-output) as an exploitable host signal.</w:t>
       </w:r>
     </w:p>
     <w:p>
@@ -215,7 +242,7 @@
           <w:b w:val="0"/>
           <w:i w:val="0"/>
         </w:rPr>
-        <w:t>Amplicon sequence variants (ASVs) were inferred with DADA2 1.38.0, independently for each run. Reads were quality-filtered and truncated with filterAndTrim (truncLen = 230 for R1 and 190 for R2; maxN = 0; maxEE = c(2, 2); truncQ = 2; rm.phix = TRUE). The chosen truncation lengths preserve a large (~167 bp) overlap for the ~253 bp V4 insert with 2×251 bp reads. Error models were learned separately for each run (learnErrors), reflecting the three distinct MiSeq sequencing runs, and reads were denoised (dada) and merged (mergePairs) into per-run sequence tables (makeSequenceTable).</w:t>
+        <w:t>Amplicon sequence variants (ASVs) were inferred with DADA2 1.38.0, independently for each run. Reads were quality-filtered and truncated with filterAndTrim (truncLen = 230 for R1 and 190 for R2; maxN = 0; maxEE = c(2, 2); truncQ = 2; rm.phix = TRUE), preserving a large (~167 bp) overlap for the ~253 bp V4 insert with 2×251 bp reads. Error models were learned separately per run (learnErrors), reflecting three distinct MiSeq runs, and reads were denoised (dada) and merged (mergePairs) into per-run sequence tables (makeSequenceTable).</w:t>
       </w:r>
     </w:p>
     <w:p>
@@ -232,7 +259,7 @@
           <w:b w:val="0"/>
           <w:i w:val="0"/>
         </w:rPr>
-        <w:t>The three per-run sequence tables were combined with mergeSequenceTables, keeping the three sequencing runs of each library distinct (samples suffixed by run, e.g. __durance1), so that the run effect remains estimable downstream. Chimeras were removed from the merged table with removeBimeraDenovo (method = "consensus"). Taxonomy was assigned against SILVA v138.2 with the naïve Bayesian classifier (assignTaxonomy, tryRC = TRUE) and species-level exact matching (addSpecies). assignTaxonomy replicates the reference in memory per thread and required 256 GB RAM (64 GB failed with out-of-memory).</w:t>
+        <w:t>The three per-run sequence tables were combined with mergeSequenceTables, keeping the runs of each library distinct (samples suffixed by run, e.g. __durance1) so that the run effect remains estimable. Chimeras were removed from the merged table with removeBimeraDenovo (method = "consensus"). Taxonomy was assigned against SILVA v138.2 with the naïve Bayesian classifier (assignTaxonomy, tryRC = TRUE) and species-level exact matching (addSpecies). assignTaxonomy replicates the reference per thread and required 256 GB RAM.</w:t>
       </w:r>
     </w:p>
     <w:p>
@@ -249,7 +276,7 @@
           <w:b w:val="0"/>
           <w:i w:val="0"/>
         </w:rPr>
-        <w:t>ASVs assigned to Eukaryota or unassigned at the domain level, to Chloroplast (Order) or to Mitochondria (Family) were removed. The mitochondrial ASVs correspond to residual full-length host 12S that escaped the length-based filter and are captured here by the taxonomic safety net.</w:t>
+        <w:t>ASVs assigned to Eukaryota or unassigned at the domain level, to Chloroplast (Order) or to Mitochondria (Family) were removed; the mitochondrial ASVs correspond to residual full-length host 12S captured by the taxonomic safety net.</w:t>
       </w:r>
     </w:p>
     <w:p>
@@ -266,7 +293,7 @@
           <w:b w:val="0"/>
           <w:i w:val="0"/>
         </w:rPr>
-        <w:t>Processing yielded a filtered ASV table of 44,349 ASVs across 2,295 samples (of 2,304 expected; nine were empty after filtering: eight controls and one biological sample present in the two other runs). Median read-pair merging was 93–94%, and ~98% of reads were retained after chimera removal; ASV length peaked sharply at 251 bp with no residual 12S. The ASV table is joined to the sample metadata (taxon, tissue, site, year, length, weight, sex) by a composite key of the form {sample}__{run}.</w:t>
+        <w:t>Processing yielded a filtered ASV table of 44,349 ASVs across 2,295 samples (of 2,304 expected; nine empty after filtering: eight controls and one biological sample present in the two other runs). Median read-pair merging was 93–94% and ~98% of reads were retained after chimera removal; ASV length peaked sharply at 251 bp with no residual 12S. The ASV table is joined to the sample metadata (taxon, tissue, site, year, length, weight, sex) by a composite key of the form {sample}__{run}.</w:t>
       </w:r>
     </w:p>
     <w:p>
@@ -283,16 +310,7 @@
           <w:b w:val="0"/>
           <w:i w:val="0"/>
         </w:rPr>
-        <w:t>The two mock aliquots (each in the three runs; six mock samples) were used to validate ASV inference. Mock ASVs were compared by BLASTn (BLAST+ 2.13.0) against a reference of the eight bacterial 16S sequences of the ZymoBIOMICS standard. Because Zymo changed five strains from lot ZRC190633 onward, the reference of the earlier strain set (archive ZR160406, contemporaneous with the 2014–2015 sequencing) was used. A confident match required ≥99% identity over ≥240 aligned bp. For each mock sample we computed the proportion of confidently Zymo-matching reads, the number of the eight expected species recovered, and the number of spurious ASVs (≥1% of sample reads without a confident Zymo hit).</w:t>
-      </w:r>
-    </w:p>
-    <w:p>
-      <w:r>
-        <w:rPr>
-          <w:b w:val="0"/>
-          <w:i w:val="0"/>
-        </w:rPr>
-        <w:t>All six mock samples recovered the eight expected bacterial species, with the eight dominant ASVs matching the reference at 100% identity over 251 bp; confidently Zymo-matching reads represented ~100% of reads in every mock, and no spurious ASV exceeded 1%, confirming accurate and clean ASV inference. (Escherichia coli and Salmonella enterica each contributed a second divergent ASV at ~99.6%, consistent with their multiple, non-identical 16S operons.)</w:t>
+        <w:t>The six mock samples (two aliquots × three runs) were used to validate ASV inference. Mock ASVs were compared by BLASTn (BLAST+ 2.13.0) against a reference of the eight bacterial 16S sequences of the ZymoBIOMICS standard. Because Zymo changed five strains from lot ZRC190633 onward, the earlier strain-set reference (archive ZR160406, contemporaneous with the 2014–2015 sequencing) was used. A confident match required ≥99% identity over ≥240 aligned bp. For each mock we computed the proportion of confidently Zymo-matching reads, the number of the eight expected species recovered, and the number of spurious ASVs (≥1% of sample reads without a confident hit). All six mocks recovered the eight expected species, with the eight dominant ASVs matching the reference at 100% identity over 251 bp; confidently matching reads represented ~100% of reads in every mock and no spurious ASV exceeded 1%, confirming accurate and clean ASV inference. (Escherichia coli and Salmonella enterica each contributed a second divergent ASV at ~99.6%, consistent with their multiple non-identical 16S operons.)</w:t>
       </w:r>
     </w:p>
     <w:p>
@@ -301,7 +319,7 @@
           <w:i/>
           <w:color w:val="C00000"/>
         </w:rPr>
-        <w:t>[À COMPLÉTER : confirmer le numéro de lot du standard Zymo pour verrouiller définitivement le choix du jeu de souches de référence (ancien ZR160406 vs refseq.v2).]</w:t>
+        <w:t>[À COMPLÉTER : confirmer le numéro de lot du standard Zymo pour verrouiller le choix du jeu de souches de référence.]</w:t>
       </w:r>
     </w:p>
     <w:p>
@@ -318,7 +336,7 @@
           <w:b w:val="0"/>
           <w:i/>
         </w:rPr>
-        <w:t>The validated ASV table is the input for the ecological analysis (decontamination from the sequenced blanks, quantification of the sequencing-run effect from the technical triplicates, and α/β-diversity comparisons among taxa, tissues and sites), and ultimately for testing whether the hybrid microbiota is intermediate between the parental species or transgressive. These steps are described in the following sections.</w:t>
+        <w:t>The validated ASV table is the input for the ecological analysis (decontamination from the sequenced blanks, quantification of the sequencing-run effect from the technical triplicates, and α/β-diversity comparisons among taxa, tissues and sites), and ultimately for testing whether the hybrid microbiota is intermediate between the parental species or transgressive.</w:t>
       </w:r>
     </w:p>
     <w:p>
@@ -327,7 +345,7 @@
           <w:i/>
           <w:color w:val="C00000"/>
         </w:rPr>
-        <w:t>[À COMPLÉTER : rédiger cette section une fois l'identification des hybrides intégrée et le plan d'analyse arrêté (indices de diversité, modèles mixtes, PERMANOVA + PERMDISP, abondance différentielle, etc.).]</w:t>
+        <w:t>[À COMPLÉTER : rédiger cette section une fois l'identification des hybrides intégrée et le plan d'analyse arrêté (indices de diversité, modèles mixtes, PERMANOVA + PERMDISP, abondance différentielle).]</w:t>
       </w:r>
     </w:p>
     <w:p>
@@ -344,7 +362,7 @@
           <w:b w:val="0"/>
           <w:i w:val="0"/>
         </w:rPr>
-        <w:t>All processing steps are scripted, version-controlled with git, and logged (runs.log), with parameter choices justified in the script headers. Metadata corrections are traced by explicit flags rather than applied silently.</w:t>
+        <w:t>All processing steps are scripted, version-controlled with git and logged (runs.log), with parameter choices justified in the script headers; metadata corrections are traced by explicit flags rather than applied silently.</w:t>
       </w:r>
     </w:p>
     <w:p>
@@ -353,7 +371,7 @@
           <w:i/>
           <w:color w:val="C00000"/>
         </w:rPr>
-        <w:t>[À COMPLÉTER : dépôt des lectures brutes dans un répertoire public (SRA/ENA) et numéro d'accession ; dépôt des métadonnées au format MIxS ; lien vers le dépôt de code (le cas échéant).]</w:t>
+        <w:t>[À COMPLÉTER : dépôt des lectures brutes (SRA/ENA) et accession ; métadonnées au format MIxS ; lien vers le dépôt de code.]</w:t>
       </w:r>
     </w:p>
     <w:sectPr>

</xml_diff>

<commit_message>
docs: M&M section 8 preparation des donnees (decontam, index hopping, artefacts mock, table analyse, arbre, rarefaction 3000) ; stats en attente index hybride
</commit_message>
<xml_diff>
--- a/docs/materials_and_methods.docx
+++ b/docs/materials_and_methods.docx
@@ -331,21 +331,146 @@
       </w:r>
     </w:p>
     <w:p>
+      <w:pPr>
+        <w:pStyle w:val="Heading2"/>
+      </w:pPr>
+      <w:r>
+        <w:rPr>
+          <w:b w:val="0"/>
+          <w:i w:val="0"/>
+        </w:rPr>
+        <w:t>8.1 Decontamination</w:t>
+      </w:r>
+    </w:p>
+    <w:p>
+      <w:pPr/>
+      <w:r>
+        <w:rPr>
+          <w:b w:val="0"/>
+          <w:i w:val="0"/>
+        </w:rPr>
+        <w:t>Reagent and laboratory contaminants were identified with decontam v1.30.0 (Davis et al. 2018) using the prevalence method, which contrasts the prevalence of each ASV in true samples against negative controls. DNA concentrations were not available for the Durance libraries, precluding the frequency method. The negative set comprised extraction blanks and PCR (no-template) negative controls, each present in all three sequencing runs (36 control samples in total); mock communities and empty wells were excluded from this step. Batches were defined by sequencing run. Two classification thresholds were compared (0.1, the package default, and 0.5). The default threshold of 0.1 was retained: it flagged 66 ASVs (0.15 % of ASVs) while retaining 99.76 % of reads, and the flagged taxa were taxonomically consistent with common reagent contaminants (Pseudomonadaceae, Moraxellaceae, Micrococcaceae, Propionibacteriaceae, Streptococcaceae). The more aggressive 0.5 threshold additionally removed 2.12 % of reads, including ASVs carrying genuine biological signal — most notably a Candidatus Branchiomonas ASV that was prevalent in gill and external tissues and essentially absent from negative controls — and was therefore rejected.</w:t>
+      </w:r>
+    </w:p>
+    <w:p>
+      <w:pPr>
+        <w:pStyle w:val="Heading2"/>
+      </w:pPr>
+      <w:r>
+        <w:rPr>
+          <w:b w:val="0"/>
+          <w:i w:val="0"/>
+        </w:rPr>
+        <w:t>8.2 Index-hopping assessment</w:t>
+      </w:r>
+    </w:p>
+    <w:p>
+      <w:pPr/>
+      <w:r>
+        <w:rPr>
+          <w:b w:val="0"/>
+          <w:i w:val="0"/>
+        </w:rPr>
+        <w:t>Cross-talk between libraries (index hopping) was quantified using the 67 empty wells, which received no library and in which any read therefore represents leakage. These wells accumulated 41 reads in total out of 26.8 million (0.0002 %; median 0 reads per well, maximum 13), indicating negligible index hopping. No background-noise subtraction was applied on this basis.</w:t>
+      </w:r>
+    </w:p>
+    <w:p>
+      <w:pPr>
+        <w:pStyle w:val="Heading2"/>
+      </w:pPr>
+      <w:r>
+        <w:rPr>
+          <w:b w:val="0"/>
+          <w:i w:val="0"/>
+        </w:rPr>
+        <w:t>8.3 Mock-derived sample-level artefacts</w:t>
+      </w:r>
+    </w:p>
+    <w:p>
+      <w:pPr/>
+      <w:r>
+        <w:rPr>
+          <w:b w:val="0"/>
+          <w:i w:val="0"/>
+        </w:rPr>
+        <w:t>The ten ASVs matching the ZymoBIOMICS reference strains were used as exogenous tracers to screen biological samples. Two nominal individuals consisted of a single caudal-fin sample dominated by mock ASVs (70 % and 99 % of reads) and were positioned in the wells and index series of the mock controls; they were confirmed as mislabelled mock wells and excluded from the biological dataset. A further set of genuine fish (nine complete individuals, whose digestive tissues were free of mock reads) showed mock ASVs at 20–65 % in a single well-tissue combination, consistent with well-level contamination; for these samples the mock ASVs were removed and the remaining, legitimate ASVs retained. Mock ASVs were removed from all samples, and ASVs left with zero counts were discarded.</w:t>
+      </w:r>
+    </w:p>
+    <w:p>
+      <w:pPr>
+        <w:pStyle w:val="Heading2"/>
+      </w:pPr>
+      <w:r>
+        <w:rPr>
+          <w:b w:val="0"/>
+          <w:i w:val="0"/>
+        </w:rPr>
+        <w:t>8.4 Analysis dataset</w:t>
+      </w:r>
+    </w:p>
+    <w:p>
+      <w:pPr/>
+      <w:r>
+        <w:rPr>
+          <w:b w:val="0"/>
+          <w:i w:val="0"/>
+        </w:rPr>
+        <w:t>After decontamination and removal of mock-derived artefacts, the analysis table comprised 44,200 ASVs across 2,180 biological samples (26.1 million reads). Median sequencing depth was 10,129 reads per sample.</w:t>
+      </w:r>
+    </w:p>
+    <w:p>
+      <w:pPr>
+        <w:pStyle w:val="Heading2"/>
+      </w:pPr>
+      <w:r>
+        <w:rPr>
+          <w:b w:val="0"/>
+          <w:i w:val="0"/>
+        </w:rPr>
+        <w:t>8.5 Phylogenetic tree</w:t>
+      </w:r>
+    </w:p>
+    <w:p>
+      <w:pPr/>
+      <w:r>
+        <w:rPr>
+          <w:b w:val="0"/>
+          <w:i w:val="0"/>
+        </w:rPr>
+        <w:t>A de novo phylogeny was built from the ASV sequences with QIIME 2 (align-to-tree-mafft-fasttree): multiple alignment with MAFFT, masking of highly variable positions, tree inference with FastTree 2, and midpoint rooting. Fragment insertion into a reference backbone (SEPP) was not used because the ASVs are near-complete V4 amplicons (~251 bp) for which de novo alignment is appropriate. The resulting rooted tree covers all ASVs of the analysis table and supports UniFrac distances and Faith's phylogenetic diversity.</w:t>
+      </w:r>
+    </w:p>
+    <w:p>
+      <w:pPr>
+        <w:pStyle w:val="Heading2"/>
+      </w:pPr>
+      <w:r>
+        <w:rPr>
+          <w:b w:val="0"/>
+          <w:i w:val="0"/>
+        </w:rPr>
+        <w:t>8.6 Normalization of sequencing effort</w:t>
+      </w:r>
+    </w:p>
+    <w:p>
+      <w:pPr/>
+      <w:r>
+        <w:rPr>
+          <w:b w:val="0"/>
+          <w:i w:val="0"/>
+        </w:rPr>
+        <w:t>Uneven sequencing effort was controlled by rarefaction, currently the most robust approach for alpha- and beta-diversity metrics (Schloss 2024). No universal threshold exists; the depth was therefore chosen on the data using three criteria. First, richness plateaued below 3,000 reads in rarefaction curves, so this depth captures the recoverable diversity. Second, a threshold of 3,000 reads retained 81.8 % of samples (1,784/2,180), against 72.6 % at 5,000 reads. Third — and decisively — sample retention at 3,000 reads was balanced across sequencing runs (80.2–83.5 % per run), the main technical batch factor, so rarefaction does not confound depth with batch. A higher threshold was rejected because it increased uneven sample loss across sites and taxa without improving coverage.</w:t>
+      </w:r>
+    </w:p>
+    <w:p>
+      <w:pPr/>
       <w:r>
         <w:rPr>
           <w:b w:val="0"/>
           <w:i/>
+          <w:color w:val="1F4E79"/>
         </w:rPr>
-        <w:t>The validated ASV table is the input for the ecological analysis (decontamination from the sequenced blanks, quantification of the sequencing-run effect from the technical triplicates, and α/β-diversity comparisons among taxa, tissues and sites), and ultimately for testing whether the hybrid microbiota is intermediate between the parental species or transgressive.</w:t>
-      </w:r>
-    </w:p>
-    <w:p>
-      <w:r>
-        <w:rPr>
-          <w:i/>
-          <w:color w:val="C00000"/>
-        </w:rPr>
-        <w:t>[À COMPLÉTER : rédiger cette section une fois l'identification des hybrides intégrée et le plan d'analyse arrêté (indices de diversité, modèles mixtes, PERMANOVA + PERMDISP, abondance différentielle).]</w:t>
+        <w:t>[À COMPLÉTER : mode d'application de la raréfaction (tirage unique vs raréfaction répétée, Cameron et al. 2021) — à trancher. Puis : indices de diversité α retenus, distances β, modèles statistiques (modèles mixtes, PERMANOVA + PERMDISP), méthode d'abondance différentielle, et contrastes le long du gradient de la zone hybride. Cette dernière partie dépend de l'index hybride en cours de génotypage.]</w:t>
       </w:r>
     </w:p>
     <w:p>

</xml_diff>

<commit_message>
fix: M&M - controles 4+8 verifies (36 negatifs, corrige le 39 errone) ; lot Zymo resolu par date + verif V4 identique entre lots ; 75 puits vides (67 avec lectures) ; divergence tissus draft/Durance signalee
</commit_message>
<xml_diff>
--- a/docs/materials_and_methods.docx
+++ b/docs/materials_and_methods.docx
@@ -128,18 +128,18 @@
       <w:r>
         <w:rPr>
           <w:i/>
-          <w:color w:val="1F6FC0"/>
+          <w:color w:val="1F4E79"/>
         </w:rPr>
-        <w:t>[Transposé du manuscrit d'origine — à confirmer pour le lot Durance : kit d'extraction Qiagen Food Mericon, méthode dual-index Kozich (2013), protocole Galan (2016), quantification Kapa, MiSeq reagent kit v3 (2×300) — tous repris du manuscrit d'origine (même assay). À confirmer que le lot Durance a suivi exactement ce protocole d'extraction et de PCR.]</w:t>
+        <w:t>[Transposé du manuscrit d'origine (même équipe, même assay) : kit Qiagen Food Mericon, dual-index Kozich (2013), protocole Galan (2016), quantification Kapa, MiSeq v3 (2×300). NB : le manuscrit d'origine décrit une extraction sur branchie et midgut seulement, alors que le jeu Durance porte sur quatre tissus (nageoire caudale, branchie, midgut, hindgut) ; c'est le plan Durance qui fait foi ici.]</w:t>
       </w:r>
     </w:p>
     <w:p>
       <w:r>
         <w:rPr>
           <w:i/>
-          <w:color w:val="C00000"/>
+          <w:color w:val="1F4E79"/>
         </w:rPr>
-        <w:t>[À COMPLÉTER : nombre exact de cycles PCR et polymérase utilisée ; dates des trois runs MiSeq ; taux de spike-in PhiX.]</w:t>
+        <w:t>[À COMPLÉTER : les conditions d'amplification sont citées par référence à Galan et al. (2016) ; si le journal exige les valeurs explicites, indiquer le nombre de cycles PCR et la polymérase. Restent nécessaires dans tous les cas : dates des trois runs MiSeq et taux de spike-in PhiX.]</w:t>
       </w:r>
     </w:p>
     <w:p>
@@ -156,7 +156,7 @@
           <w:b w:val="0"/>
           <w:i w:val="0"/>
         </w:rPr>
-        <w:t>Extraction blanks and no-template PCR controls (39 controls in total, each sequenced across the three runs), and two aliquots of a commercial mock community — the ZymoBIOMICS Microbial Community Standard (Zymo Research, Irvine, CA, USA), a defined mixture of eight known bacterial taxa — were processed and sequenced alongside the biological samples for contamination assessment and positive-control validation.</w:t>
+        <w:t>Negative controls comprised extraction blanks and no-template PCR controls; the original sequencing project of this laboratory reports the same two categories (four extraction negative controls and eight amplification negative controls). In the Durance dataset we verified four extraction blanks — one per tissue (Blanc-Caudal, Blanc-Branchie, Blanc-Midgut, Blanc-Hindgut) — and eight no-template PCR controls (T-1 to T-8), each sequenced in all three runs, i.e. 12 and 24 control samples respectively (36 negative controls in total). Two aliquots of a commercial mock community — the ZymoBIOMICS Microbial Community Standard (Zymo Research, Irvine, CA, USA), a defined mixture of eight known bacterial taxa — were processed alongside the samples as positive controls (6 mock samples across runs). In addition, 75 empty wells received no library and were sequenced to monitor index hopping between libraries.</w:t>
       </w:r>
     </w:p>
     <w:p>
@@ -172,9 +172,9 @@
       <w:r>
         <w:rPr>
           <w:i/>
-          <w:color w:val="C00000"/>
+          <w:color w:val="1F4E79"/>
         </w:rPr>
-        <w:t>[À COMPLÉTER : référence catalogue et NUMÉRO DE LOT exact du standard Zymo (détermine le jeu de souches de référence, cf. §7) ; répartition précise blancs d'extraction vs contrôles PCR.]</w:t>
+        <w:t>[À COMPLÉTER : référence catalogue du standard ZymoBIOMICS. Le numéro de lot n'a pas été consigné ; voir §7 pour la résolution du jeu de souches de référence.]</w:t>
       </w:r>
     </w:p>
     <w:p>
@@ -316,10 +316,10 @@
     <w:p>
       <w:r>
         <w:rPr>
-          <w:i/>
+          <w:i w:val="0"/>
           <w:color w:val="C00000"/>
         </w:rPr>
-        <w:t>[À COMPLÉTER : confirmer le numéro de lot du standard Zymo pour verrouiller le choix du jeu de souches de référence.]</w:t>
+        <w:t>Lot numbers were not recorded for the standard used here; however, the sequencing was performed in 2014–2015, which predates the ZRC190633 lot from which the five strains were changed, so the earlier strain set applies. This choice does not affect the validation: we verified that over the amplified V4 region the 16S sequences of the two reference sets are identical for all eight species — including Enterococcus faecalis and Staphylococcus aureus, whose full-length 16S differ between lots — so the mock ASVs match either reference equally and the recovery of 8/8 expected species is independent of the lot assignment.</w:t>
       </w:r>
     </w:p>
     <w:p>
@@ -371,7 +371,7 @@
           <w:b w:val="0"/>
           <w:i w:val="0"/>
         </w:rPr>
-        <w:t>Cross-talk between libraries (index hopping) was quantified using the 67 empty wells, which received no library and in which any read therefore represents leakage. These wells accumulated 41 reads in total out of 26.8 million (0.0002 %; median 0 reads per well, maximum 13), indicating negligible index hopping. No background-noise subtraction was applied on this basis.</w:t>
+        <w:t>Cross-talk between libraries (index hopping) was quantified using the 75 empty wells, which received no library and in which any read therefore represents leakage (67 of them retained at least one read after filtering; the remaining 8 contained none). Across all empty wells these accumulated 41 reads out of 26.8 million (0.0002 %; median 0 reads per well, maximum 13), indicating negligible index hopping. No background-noise subtraction was applied on this basis.</w:t>
       </w:r>
     </w:p>
     <w:p>

</xml_diff>

<commit_message>
feat: M&M - dates runs MiSeq 2017 (10/07, 05/10, 03/11) + PhiX 10 pct + Zymo D6300 ; corrige la date de sequencage (2017 pas 2014-2015) dans la justification du lot
</commit_message>
<xml_diff>
--- a/docs/materials_and_methods.docx
+++ b/docs/materials_and_methods.docx
@@ -130,16 +130,16 @@
           <w:i/>
           <w:color w:val="1F4E79"/>
         </w:rPr>
-        <w:t>[Transposé du manuscrit d'origine (même équipe, même assay) : kit Qiagen Food Mericon, dual-index Kozich (2013), protocole Galan (2016), quantification Kapa, MiSeq v3 (2×300). NB : le manuscrit d'origine décrit une extraction sur branchie et midgut seulement, alors que le jeu Durance porte sur quatre tissus (nageoire caudale, branchie, midgut, hindgut) ; c'est le plan Durance qui fait foi ici.]</w:t>
+        <w:t>[Transposé du manuscrit d'origine (même équipe, même assay) : kit Qiagen Food Mericon, dual-index Kozich (2013), protocole Galan (2016), quantification Kapa, MiSeq v3 (2×300). Le manuscrit d'origine ne portait que sur une partie des données (branchie et midgut) ; le plan Durance à quatre tissus fait foi — confirmé par les co-auteurs.]</w:t>
       </w:r>
     </w:p>
     <w:p>
       <w:r>
         <w:rPr>
-          <w:i/>
+          <w:i w:val="0"/>
           <w:color w:val="1F4E79"/>
         </w:rPr>
-        <w:t>[À COMPLÉTER : les conditions d'amplification sont citées par référence à Galan et al. (2016) ; si le journal exige les valeurs explicites, indiquer le nombre de cycles PCR et la polymérase. Restent nécessaires dans tous les cas : dates des trois runs MiSeq et taux de spike-in PhiX.]</w:t>
+        <w:t>Libraries were sequenced on an Illumina MiSeq on 10 July 2017 (durance1), 5 October 2017 (durance2) and 3 November 2017 (durance3), with a 10 % PhiX spike-in. PCR conditions, purification and pooling followed Galan et al. (2016).</w:t>
       </w:r>
     </w:p>
     <w:p>
@@ -171,10 +171,10 @@
     <w:p>
       <w:r>
         <w:rPr>
-          <w:i/>
+          <w:i w:val="0"/>
           <w:color w:val="1F4E79"/>
         </w:rPr>
-        <w:t>[À COMPLÉTER : référence catalogue du standard ZymoBIOMICS. Le numéro de lot n'a pas été consigné ; voir §7 pour la résolution du jeu de souches de référence.]</w:t>
+        <w:t>The mock community was the ZymoBIOMICS Microbial Community Standard (Zymo Research, cat. D6300).</w:t>
       </w:r>
     </w:p>
     <w:p>
@@ -310,7 +310,7 @@
           <w:b w:val="0"/>
           <w:i w:val="0"/>
         </w:rPr>
-        <w:t>The six mock samples (two aliquots × three runs) were used to validate ASV inference. Mock ASVs were compared by BLASTn (BLAST+ 2.13.0) against a reference of the eight bacterial 16S sequences of the ZymoBIOMICS standard. Because Zymo changed five strains from lot ZRC190633 onward, the earlier strain-set reference (archive ZR160406, contemporaneous with the 2014–2015 sequencing) was used. A confident match required ≥99% identity over ≥240 aligned bp. For each mock we computed the proportion of confidently Zymo-matching reads, the number of the eight expected species recovered, and the number of spurious ASVs (≥1% of sample reads without a confident hit). All six mocks recovered the eight expected species, with the eight dominant ASVs matching the reference at 100% identity over 251 bp; confidently matching reads represented ~100% of reads in every mock and no spurious ASV exceeded 1%, confirming accurate and clean ASV inference. (Escherichia coli and Salmonella enterica each contributed a second divergent ASV at ~99.6%, consistent with their multiple non-identical 16S operons.)</w:t>
+        <w:t>The six mock samples (two aliquots × three runs) were used to validate ASV inference. Mock ASVs were compared by BLASTn (BLAST+ 2.13.0) against a reference of the eight bacterial 16S sequences of the ZymoBIOMICS standard. Because Zymo changed five strains from lot ZRC190633 onward, the earlier strain-set reference (archive ZR160406, corresponding to lots predating the 2019 strain change) was used. A confident match required ≥99% identity over ≥240 aligned bp. For each mock we computed the proportion of confidently Zymo-matching reads, the number of the eight expected species recovered, and the number of spurious ASVs (≥1% of sample reads without a confident hit). All six mocks recovered the eight expected species, with the eight dominant ASVs matching the reference at 100% identity over 251 bp; confidently matching reads represented ~100% of reads in every mock and no spurious ASV exceeded 1%, confirming accurate and clean ASV inference. (Escherichia coli and Salmonella enterica each contributed a second divergent ASV at ~99.6%, consistent with their multiple non-identical 16S operons.)</w:t>
       </w:r>
     </w:p>
     <w:p>
@@ -319,7 +319,7 @@
           <w:i w:val="0"/>
           <w:color w:val="C00000"/>
         </w:rPr>
-        <w:t>Lot numbers were not recorded for the standard used here; however, the sequencing was performed in 2014–2015, which predates the ZRC190633 lot from which the five strains were changed, so the earlier strain set applies. This choice does not affect the validation: we verified that over the amplified V4 region the 16S sequences of the two reference sets are identical for all eight species — including Enterococcus faecalis and Staphylococcus aureus, whose full-length 16S differ between lots — so the mock ASVs match either reference equally and the recovery of 8/8 expected species is independent of the lot assignment.</w:t>
+        <w:t>Lot numbers were not recorded for the standard used here; however, sequencing was performed in 2017 (July–November), which predates the ZRC190633 lot from which the five strains were changed, so the earlier strain set applies. This choice does not affect the validation: we verified that over the amplified V4 region the 16S sequences of the two reference sets are identical for all eight species — including Enterococcus faecalis and Staphylococcus aureus, whose full-length 16S differ between lots — so the mock ASVs match either reference equally and the recovery of 8/8 expected species is independent of the lot assignment.</w:t>
       </w:r>
     </w:p>
     <w:p>

</xml_diff>

<commit_message>
feat: design des runs etabli (2 librairies PCR independantes, d2+d3 partagent la librairie B) ; M&M section 3 corrigee + 8.7 structure de replication emboitee
</commit_message>
<xml_diff>
--- a/docs/materials_and_methods.docx
+++ b/docs/materials_and_methods.docx
@@ -121,7 +121,7 @@
           <w:b w:val="0"/>
           <w:i w:val="0"/>
         </w:rPr>
-        <w:t>For the present study, the same 768 libraries were sequenced three independent times (runs durance1, durance2 and durance3; distinct flow cells and i5 index sets, identical plate layout and i7 indices). Each biological sample is therefore present in triplicate across runs, allowing the sequencing-run effect to be estimated directly, unconfounded with any biological factor.</w:t>
+        <w:t>For the present study the 768 samples were processed through two independent library preparations, each using the one-step dual-index PCR of Kozich et al. (2013), in which the indices are incorporated during amplification. The first amplicon library was sequenced once (run durance1); the second, prepared from an independent PCR of the same samples, was sequenced twice on separate flow cells (runs durance2 and durance3). Plate layout and i7 indices were identical throughout, whereas the i5 index set differs between the two libraries — a direct consequence of the one-step protocol, in which re-indexing an existing amplicon pool is not possible. Each biological sample is therefore represented three times, but with a nested rather than a flat replication structure: two levels of library preparation, and two sequencing runs within the second library. This design separates the variability contributed by library preparation from that contributed by sequencing alone, and neither is confounded with any biological factor.</w:t>
       </w:r>
     </w:p>
     <w:p>
@@ -475,6 +475,44 @@
     </w:p>
     <w:p>
       <w:pPr>
+        <w:pStyle w:val="Heading2"/>
+      </w:pPr>
+      <w:r>
+        <w:rPr>
+          <w:i w:val="0"/>
+        </w:rPr>
+        <w:t>8.7 Technical replication structure</w:t>
+      </w:r>
+    </w:p>
+    <w:p>
+      <w:pPr/>
+      <w:r>
+        <w:rPr>
+          <w:i w:val="0"/>
+        </w:rPr>
+        <w:t>The nested replication structure was characterised directly from the data. For the 548 samples reaching 3,000 reads in all three runs, each pair of runs was compared within sample after rarefaction to a common depth, so that detection probability is identical by construction. Two complementary statistics were used: Bray–Curtis and Jaccard dissimilarity between the two versions of a sample, and the recapture rate of rare ASVs (1–3 reads in one run, detected at all in the other).</w:t>
+      </w:r>
+    </w:p>
+    <w:p>
+      <w:pPr/>
+      <w:r>
+        <w:rPr>
+          <w:i w:val="0"/>
+        </w:rPr>
+        <w:t>The two runs sharing a library (durance2 and durance3) were markedly more similar to each other (mean Bray–Curtis 0.118, Jaccard 0.445, rare-ASV recapture 0.484) than either was to the run from the independent library (durance1: Bray–Curtis 0.248 and 0.248, Jaccard 0.722 and 0.719, recapture 0.196 and 0.193). The two library-crossing comparisons were statistically indistinguishable from each other (paired Wilcoxon on Bray–Curtis, p = 0.48) and both differed strongly from the within-library comparison (p &lt; 10⁻⁸⁹). Raw per-sample depths were almost perfectly correlated within the shared library (Spearman ρ = 0.999) and only moderately so across libraries (ρ = 0.79). The pattern is therefore consistent with the design described in §3 and inconsistent with three interchangeable sequencing replicates.</w:t>
+      </w:r>
+    </w:p>
+    <w:p>
+      <w:pPr/>
+      <w:r>
+        <w:rPr>
+          <w:i w:val="0"/>
+        </w:rPr>
+        <w:t>Two consequences follow for the analyses. First, library preparation roughly doubles the technical dissimilarity contributed by sequencing alone, and its effect is proportionally larger on presence–absence (Jaccard) than on relative abundances (Bray–Curtis), indicating that preparation mainly changes which rare taxa are detected. Second, sequencing run cannot be treated as a three-level factor with interchangeable levels, since the levels are not equidistant; run is instead modelled as sequencing nested within library preparation.</w:t>
+      </w:r>
+    </w:p>
+    <w:p>
+      <w:pPr>
         <w:pStyle w:val="Heading1"/>
       </w:pPr>
       <w:r>

</xml_diff>

<commit_message>
feat: partition de variance (technique 0.03 pct vs tissu 9.2 pct + poisson 37.7 pct), figure et paragraphe Results ; M&M 8.7 resserre
</commit_message>
<xml_diff>
--- a/docs/materials_and_methods.docx
+++ b/docs/materials_and_methods.docx
@@ -487,28 +487,13 @@
     <w:p>
       <w:pPr/>
       <w:r>
-        <w:rPr>
-          <w:i w:val="0"/>
-        </w:rPr>
-        <w:t>The nested replication structure was characterised directly from the data. For the 548 samples reaching 3,000 reads in all three runs, each pair of runs was compared within sample after rarefaction to a common depth, so that detection probability is identical by construction. Two complementary statistics were used: Bray–Curtis and Jaccard dissimilarity between the two versions of a sample, and the recapture rate of rare ASVs (1–3 reads in one run, detected at all in the other).</w:t>
+        <w:t>The nested replication structure was verified directly from the data. Each pair of runs was compared within sample after rarefaction to a common depth, so that detection probability is identical by construction (548 samples reaching 3,000 reads in all three runs). The two runs sharing a library were markedly more similar to each other (mean Bray–Curtis 0.118, Jaccard 0.445) than either was to the run from the independent library (0.248 and 0.719 respectively); the two library-crossing comparisons were statistically indistinguishable from each other (paired Wilcoxon, p = 0.48) and both differed from the within-library comparison (p &lt; 10⁻⁸⁹). Recapture of rare ASVs (1–3 reads) showed the same pattern (0.48 within library vs 0.19 across).</w:t>
       </w:r>
     </w:p>
     <w:p>
       <w:pPr/>
       <w:r>
-        <w:rPr>
-          <w:i w:val="0"/>
-        </w:rPr>
-        <w:t>The two runs sharing a library (durance2 and durance3) were markedly more similar to each other (mean Bray–Curtis 0.118, Jaccard 0.445, rare-ASV recapture 0.484) than either was to the run from the independent library (durance1: Bray–Curtis 0.248 and 0.248, Jaccard 0.722 and 0.719, recapture 0.196 and 0.193). The two library-crossing comparisons were statistically indistinguishable from each other (paired Wilcoxon on Bray–Curtis, p = 0.48) and both differed strongly from the within-library comparison (p &lt; 10⁻⁸⁹). Raw per-sample depths were almost perfectly correlated within the shared library (Spearman ρ = 0.999) and only moderately so across libraries (ρ = 0.79). The pattern is therefore consistent with the design described in §3 and inconsistent with three interchangeable sequencing replicates.</w:t>
-      </w:r>
-    </w:p>
-    <w:p>
-      <w:pPr/>
-      <w:r>
-        <w:rPr>
-          <w:i w:val="0"/>
-        </w:rPr>
-        <w:t>Two consequences follow for the analyses. First, library preparation roughly doubles the technical dissimilarity contributed by sequencing alone, and its effect is proportionally larger on presence–absence (Jaccard) than on relative abundances (Bray–Curtis), indicating that preparation mainly changes which rare taxa are detected. Second, sequencing run cannot be treated as a three-level factor with interchangeable levels, since the levels are not equidistant; run is instead modelled as sequencing nested within library preparation.</w:t>
+        <w:t>Library preparation therefore roughly doubles the technical dissimilarity contributed by sequencing alone, with a proportionally larger effect on presence–absence than on relative abundances. Sequencing run was accordingly modelled as nested within library preparation rather than as a three-level factor with interchangeable levels. Because each sample is present in every batch, technical and biological factors are crossed rather than confounded, so batch-correction methods designed for confounded meta-analyses were not applied.</w:t>
       </w:r>
     </w:p>
     <w:p>

</xml_diff>

<commit_message>
feat: M&M 8.6 mode de rarefaction (repetee, moyenne des metriques, alpha N=1000 beta N=400, erreur MC quantifiee et reserve semi-metrique)
</commit_message>
<xml_diff>
--- a/docs/materials_and_methods.docx
+++ b/docs/materials_and_methods.docx
@@ -466,11 +466,37 @@
       <w:pPr/>
       <w:r>
         <w:rPr>
-          <w:b w:val="0"/>
+          <w:i w:val="0"/>
+        </w:rPr>
+        <w:t>Rarefaction was applied repeatedly rather than as a single draw (Cameron et al. 2021). Alpha-diversity indices (observed richness, Shannon, inverse Simpson) were averaged over 1,000 independent rarefactions, and Bray–Curtis and Jaccard dissimilarity matrices over 400. Metrics were averaged rather than count tables: averaging tables would populate each cell with the union of detections across draws and inflate observed richness above what 3,000 reads can support, reintroducing the very depth dependence that rarefaction removes.</w:t>
+      </w:r>
+    </w:p>
+    <w:p>
+      <w:pPr/>
+      <w:r>
+        <w:rPr>
+          <w:i w:val="0"/>
+        </w:rPr>
+        <w:t>Monte-Carlo error was quantified rather than assumed. Because a cumulative mean at N draws and one at 2N share their first N draws and are therefore autocorrelated, convergence was assessed by running two independent chains with disjoint seeds and comparing their means at matched iteration counts, the standard error of a single chain being sd(chain₁ − chain₂)/√2. This error decreased as N^−0.49 (Bray–Curtis) and N^−0.51 (Jaccard), matching the N^−0.5 expected for an average of independent draws. At 100 iterations it stood at 0.04 % of the mean dissimilarity (0.0004 in absolute terms), three orders of magnitude below both the technical (0.118–0.248) and the biological (0.880) dissimilarity scales reported in §8.7, so 100 iterations would have sufficed for the beta-diversity matrices. Median Monte-Carlo standard deviations for the alpha indices were 0.023 for Shannon (0.8 % of the median value), 2.37 for observed richness (1.9 %) and 0.21 for inverse Simpson (2.5 %); the abundance-weighted indices were thus the more stable, consistent with the limited reproducibility of rare ASVs (§8.7).</w:t>
+      </w:r>
+    </w:p>
+    <w:p>
+      <w:pPr/>
+      <w:r>
+        <w:rPr>
+          <w:i w:val="0"/>
+        </w:rPr>
+        <w:t>Note that an averaged dissimilarity matrix is not guaranteed to satisfy the triangle inequality. This does not affect PERMANOVA or principal coordinates analysis, both of which accept semi-metrics, but the averaged matrices were not used in any method requiring a true metric.</w:t>
+      </w:r>
+    </w:p>
+    <w:p>
+      <w:pPr/>
+      <w:r>
+        <w:rPr>
           <w:i/>
           <w:color w:val="1F4E79"/>
         </w:rPr>
-        <w:t>[À COMPLÉTER : mode d'application de la raréfaction (tirage unique vs raréfaction répétée, Cameron et al. 2021) — à trancher. Puis : indices de diversité α retenus, distances β, modèles statistiques (modèles mixtes, PERMANOVA + PERMDISP), méthode d'abondance différentielle, et contrastes le long du gradient de la zone hybride. Cette dernière partie dépend de l'index hybride en cours de génotypage.]</w:t>
+        <w:t>[À COMPLÉTER : modèles statistiques — structure des effets aléatoires (séquençage niché dans la préparation de librairie, cf. §8.7), PERMANOVA et PERMDISP, méthode d'abondance différentielle, et contrastes le long du gradient de la zone hybride. Dépend de l'index hybride en cours de génotypage.]</w:t>
       </w:r>
     </w:p>
     <w:p>

</xml_diff>

<commit_message>
chore: retirer le Materials & Methods autonome - verification paragraphe par paragraphe : 62 paragraphes communs, aucun des 7 propres au M&M ne porte d information absente de l Article, et il conservait l affirmation fausse sur les index i7 corrigee ailleurs. Bandeau SUPERSEDED, phrase fausse neutralisee avec renvoi, fichier conserve pour l historique. Les Methods se maintiennent desormais dans Article.docx seul
</commit_message>
<xml_diff>
--- a/docs/materials_and_methods.docx
+++ b/docs/materials_and_methods.docx
@@ -2,6 +2,19 @@
 <file path=word/document.xml><?xml version="1.0" encoding="utf-8"?>
 <w:document xmlns:wpc="http://schemas.microsoft.com/office/word/2010/wordprocessingCanvas" xmlns:mo="http://schemas.microsoft.com/office/mac/office/2008/main" xmlns:mc="http://schemas.openxmlformats.org/markup-compatibility/2006" xmlns:mv="urn:schemas-microsoft-com:mac:vml" xmlns:o="urn:schemas-microsoft-com:office:office" xmlns:r="http://schemas.openxmlformats.org/officeDocument/2006/relationships" xmlns:m="http://schemas.openxmlformats.org/officeDocument/2006/math" xmlns:v="urn:schemas-microsoft-com:vml" xmlns:wp14="http://schemas.microsoft.com/office/word/2010/wordprocessingDrawing" xmlns:wp="http://schemas.openxmlformats.org/drawingml/2006/wordprocessingDrawing" xmlns:w10="urn:schemas-microsoft-com:office:word" xmlns:w="http://schemas.openxmlformats.org/wordprocessingml/2006/main" xmlns:w14="http://schemas.microsoft.com/office/word/2010/wordml" xmlns:wpg="http://schemas.microsoft.com/office/word/2010/wordprocessingGroup" xmlns:wpi="http://schemas.microsoft.com/office/word/2010/wordprocessingInk" xmlns:wne="http://schemas.microsoft.com/office/word/2006/wordml" xmlns:wps="http://schemas.microsoft.com/office/word/2010/wordprocessingShape" mc:Ignorable="w14 wp14">
   <w:body>
+    <w:p>
+      <w:pPr>
+        <w:pStyle w:val="Title"/>
+      </w:pPr>
+      <w:r/>
+      <w:r>
+        <w:rPr>
+          <w:b/>
+          <w:color w:val="B2182B"/>
+        </w:rPr>
+        <w:t>DOCUMENT SUPERSEDED — 2026-08-31. This standalone Materials &amp; Methods has been superseded by the Methods sections of docs/manuscrit/Article.docx, which contains every paragraph of this file plus the corrections and additions made since. Do not edit or cite this file. It is kept only as a record; the git history holds its earlier states. Known defects retained here for the record: the index-assignment sentence in §3 is wrong (see the correction below), §9 still carries a placeholder although the ENA accession PRJEB124417 is known, and §§8.6–8.9 lack the phylogenetic metrics, the depth-agreement measurement, the plate-position effect and the confounding structure.</w:t>
+      </w:r>
+    </w:p>
     <w:p>
       <w:pPr>
         <w:pStyle w:val="Title"/>
@@ -144,7 +157,12 @@
           <w:b w:val="0"/>
           <w:i w:val="0"/>
         </w:rPr>
-        <w:t>For the present study the 768 samples were processed through two independent library preparations, each using the one-step dual-index PCR of Kozich et al. (2013), in which the indices are incorporated during amplification. The first amplicon library was sequenced once (run durance1); the second, prepared from an independent PCR of the same samples, was sequenced twice on separate flow cells (runs durance2 and durance3). Plate layout and i7 indices were identical throughout, whereas the i5 index set differs between the two libraries — a direct consequence of the one-step protocol, in which re-indexing an existing amplicon pool is not possible. Each biological sample is therefore represented three times, but with a nested rather than a flat replication structure: two levels of library preparation, and two sequencing runs within the second library. This design separates the variability contributed by library preparation from that contributed by sequencing alone, and neither is confounded with any biological factor.</w:t>
+      </w:r>
+      <w:r>
+        <w:rPr>
+          <w:color w:val="B2182B"/>
+        </w:rPr>
+        <w:t>For the present study the 768 samples were processed through two independent library preparations, each using the one-step dual-index PCR of Kozich et al. (2013), in which the indices are incorporated during amplification. The first amplicon library was sequenced once (run durance1); the second, prepared from an independent PCR of the same samples, was sequenced twice on separate flow cells (runs durance2 and durance3). [FALSE — CORRECTED IN Article.docx: the same plate layout and the same set of 768 index combinations were used for both preparations, but the assignment of index pairs to wells differs: relative to durance1, the i7 index differs for 384 of the 768 libraries and the i5 index for 576, whereas durance2 and durance3 carry identical index pairs throughout. The sentence originally here generalised from a single plate.] Each biological sample is therefore represented three times, but with a nested rather than a flat replication structure: two levels of library preparation, and two sequencing runs within the second library. This design separates the variability contributed by library preparation from that contributed by sequencing alone, and neither is confounded with any biological factor.</w:t>
       </w:r>
     </w:p>
     <w:p>

</xml_diff>